<commit_message>
fix(documentos): aplica moldura de marca (cabecalho/rodape/A4) aos templates CNCS, MFA e Gestao + script de manutencao
</commit_message>
<xml_diff>
--- a/backend/assets/templates/declaracao-mfa-template.docx
+++ b/backend/assets/templates/declaracao-mfa-template.docx
@@ -373,13 +373,79 @@
       </w:r>
     </w:p>
     <w:sectPr>
-      <w:pgSz w:w="12240" w:h="15840"/>
-      <w:pgMar w:top="1440" w:right="1800" w:bottom="1440" w:left="1800" w:header="720" w:footer="720" w:gutter="0"/>
+      <w:headerReference w:type="default" r:id="rId9"/>
+      <w:footerReference w:type="default" r:id="rId10"/>
+      <w:pgSz w:w="11906" w:h="16838"/>
+      <w:pgMar w:top="1100" w:right="1200" w:bottom="1100" w:left="1200" w:header="708" w:footer="708" w:gutter="0"/>
       <w:cols w:space="720"/>
       <w:docGrid w:linePitch="360"/>
     </w:sectPr>
   </w:body>
 </w:document>
+</file>
+
+<file path=word/footer1.xml><?xml version="1.0" encoding="utf-8"?>
+<w:ftr xmlns:wpc="http://schemas.microsoft.com/office/word/2010/wordprocessingCanvas" xmlns:cx="http://schemas.microsoft.com/office/drawing/2014/chartex" xmlns:cx1="http://schemas.microsoft.com/office/drawing/2015/9/8/chartex" xmlns:cx2="http://schemas.microsoft.com/office/drawing/2015/10/21/chartex" xmlns:cx3="http://schemas.microsoft.com/office/drawing/2016/5/9/chartex" xmlns:cx4="http://schemas.microsoft.com/office/drawing/2016/5/10/chartex" xmlns:cx5="http://schemas.microsoft.com/office/drawing/2016/5/11/chartex" xmlns:cx6="http://schemas.microsoft.com/office/drawing/2016/5/12/chartex" xmlns:cx7="http://schemas.microsoft.com/office/drawing/2016/5/13/chartex" xmlns:cx8="http://schemas.microsoft.com/office/drawing/2016/5/14/chartex" xmlns:mc="http://schemas.openxmlformats.org/markup-compatibility/2006" xmlns:aink="http://schemas.microsoft.com/office/drawing/2016/ink" xmlns:am3d="http://schemas.microsoft.com/office/drawing/2017/model3d" xmlns:o="urn:schemas-microsoft-com:office:office" xmlns:oel="http://schemas.microsoft.com/office/2019/extlst" xmlns:r="http://schemas.openxmlformats.org/officeDocument/2006/relationships" xmlns:m="http://schemas.openxmlformats.org/officeDocument/2006/math" xmlns:v="urn:schemas-microsoft-com:vml" xmlns:wp14="http://schemas.microsoft.com/office/word/2010/wordprocessingDrawing" xmlns:wp="http://schemas.openxmlformats.org/drawingml/2006/wordprocessingDrawing" xmlns:w10="urn:schemas-microsoft-com:office:word" xmlns:w="http://schemas.openxmlformats.org/wordprocessingml/2006/main" xmlns:w14="http://schemas.microsoft.com/office/word/2010/wordml" xmlns:w15="http://schemas.microsoft.com/office/word/2012/wordml" xmlns:w16cex="http://schemas.microsoft.com/office/word/2018/wordml/cex" xmlns:w16cid="http://schemas.microsoft.com/office/word/2016/wordml/cid" xmlns:w16="http://schemas.microsoft.com/office/word/2018/wordml" xmlns:w16du="http://schemas.microsoft.com/office/word/2023/wordml/word16du" xmlns:w16sdtdh="http://schemas.microsoft.com/office/word/2020/wordml/sdtdatahash" xmlns:w16sdtfl="http://schemas.microsoft.com/office/word/2024/wordml/sdtformatlock" xmlns:w16se="http://schemas.microsoft.com/office/word/2015/wordml/symex" xmlns:wpg="http://schemas.microsoft.com/office/word/2010/wordprocessingGroup" xmlns:wpi="http://schemas.microsoft.com/office/word/2010/wordprocessingInk" xmlns:wne="http://schemas.microsoft.com/office/word/2006/wordml" xmlns:wps="http://schemas.microsoft.com/office/word/2010/wordprocessingShape" mc:Ignorable="w14 w15 w16se w16cid w16 w16cex w16sdtdh w16sdtfl w16du wp14">
+  <w:p>
+    <w:pPr>
+      <w:pBdr>
+        <w:top w:val="single" w:sz="4" w:space="1" w:color="2E75B6"/>
+      </w:pBdr>
+      <w:spacing w:before="80"/>
+    </w:pPr>
+    <w:r>
+      <w:rPr>
+        <w:i/>
+        <w:iCs/>
+        <w:color w:val="7F7F7F"/>
+        <w:sz w:val="17"/>
+        <w:szCs w:val="17"/>
+      </w:rPr>
+      <w:t>Autoavaliação organizacional — CISPLAN  ·  Não constitui certificação nem auditoria de conformidade formal</w:t>
+    </w:r>
+  </w:p>
+</w:ftr>
+</file>
+
+<file path=word/header1.xml><?xml version="1.0" encoding="utf-8"?>
+<w:hdr xmlns:wpc="http://schemas.microsoft.com/office/word/2010/wordprocessingCanvas" xmlns:cx="http://schemas.microsoft.com/office/drawing/2014/chartex" xmlns:cx1="http://schemas.microsoft.com/office/drawing/2015/9/8/chartex" xmlns:cx2="http://schemas.microsoft.com/office/drawing/2015/10/21/chartex" xmlns:cx3="http://schemas.microsoft.com/office/drawing/2016/5/9/chartex" xmlns:cx4="http://schemas.microsoft.com/office/drawing/2016/5/10/chartex" xmlns:cx5="http://schemas.microsoft.com/office/drawing/2016/5/11/chartex" xmlns:cx6="http://schemas.microsoft.com/office/drawing/2016/5/12/chartex" xmlns:cx7="http://schemas.microsoft.com/office/drawing/2016/5/13/chartex" xmlns:cx8="http://schemas.microsoft.com/office/drawing/2016/5/14/chartex" xmlns:mc="http://schemas.openxmlformats.org/markup-compatibility/2006" xmlns:aink="http://schemas.microsoft.com/office/drawing/2016/ink" xmlns:am3d="http://schemas.microsoft.com/office/drawing/2017/model3d" xmlns:o="urn:schemas-microsoft-com:office:office" xmlns:oel="http://schemas.microsoft.com/office/2019/extlst" xmlns:r="http://schemas.openxmlformats.org/officeDocument/2006/relationships" xmlns:m="http://schemas.openxmlformats.org/officeDocument/2006/math" xmlns:v="urn:schemas-microsoft-com:vml" xmlns:wp14="http://schemas.microsoft.com/office/word/2010/wordprocessingDrawing" xmlns:wp="http://schemas.openxmlformats.org/drawingml/2006/wordprocessingDrawing" xmlns:w10="urn:schemas-microsoft-com:office:word" xmlns:w="http://schemas.openxmlformats.org/wordprocessingml/2006/main" xmlns:w14="http://schemas.microsoft.com/office/word/2010/wordml" xmlns:w15="http://schemas.microsoft.com/office/word/2012/wordml" xmlns:w16cex="http://schemas.microsoft.com/office/word/2018/wordml/cex" xmlns:w16cid="http://schemas.microsoft.com/office/word/2016/wordml/cid" xmlns:w16="http://schemas.microsoft.com/office/word/2018/wordml" xmlns:w16du="http://schemas.microsoft.com/office/word/2023/wordml/word16du" xmlns:w16sdtdh="http://schemas.microsoft.com/office/word/2020/wordml/sdtdatahash" xmlns:w16sdtfl="http://schemas.microsoft.com/office/word/2024/wordml/sdtformatlock" xmlns:w16se="http://schemas.microsoft.com/office/word/2015/wordml/symex" xmlns:wpg="http://schemas.microsoft.com/office/word/2010/wordprocessingGroup" xmlns:wpi="http://schemas.microsoft.com/office/word/2010/wordprocessingInk" xmlns:wne="http://schemas.microsoft.com/office/word/2006/wordml" xmlns:wps="http://schemas.microsoft.com/office/word/2010/wordprocessingShape" mc:Ignorable="w14 w15 w16se w16cid w16 w16cex w16sdtdh w16sdtfl w16du wp14">
+  <w:p>
+    <w:pPr>
+      <w:pBdr>
+        <w:bottom w:val="single" w:sz="6" w:space="1" w:color="2E75B6"/>
+      </w:pBdr>
+      <w:tabs>
+        <w:tab w:val="right" w:pos="9026"/>
+      </w:tabs>
+      <w:spacing w:after="100"/>
+    </w:pPr>
+    <w:r>
+      <w:rPr>
+        <w:color w:val="7F7F7F"/>
+        <w:sz w:val="18"/>
+        <w:szCs w:val="18"/>
+      </w:rPr>
+      <w:t>DECLARAÇÃO DE MFA — AUTOAVALIAÇÃO  |  CONFIDENCIAL</w:t>
+    </w:r>
+    <w:r>
+      <w:rPr>
+        <w:sz w:val="18"/>
+        <w:szCs w:val="18"/>
+      </w:rPr>
+      <w:tab/>
+    </w:r>
+    <w:r>
+      <w:rPr>
+        <w:b/>
+        <w:bCs/>
+        <w:color w:val="2E75B6"/>
+        <w:sz w:val="18"/>
+        <w:szCs w:val="18"/>
+      </w:rPr>
+      <w:t>Art. 21.º NIS2  ·  DL 125/2025</w:t>
+    </w:r>
+  </w:p>
+</w:hdr>
 </file>
 
 <file path=word/numbering.xml><?xml version="1.0" encoding="utf-8"?>
@@ -24234,7 +24300,7 @@
 </file>
 
 <file path=word/theme/theme1.xml><?xml version="1.0" encoding="utf-8"?>
-<a:theme xmlns:a="http://schemas.openxmlformats.org/drawingml/2006/main" name="Office Theme">
+<a:theme xmlns:a="http://schemas.openxmlformats.org/drawingml/2006/main" name="Tema do Office">
   <a:themeElements>
     <a:clrScheme name="Office">
       <a:dk1>
@@ -24244,44 +24310,44 @@
         <a:sysClr val="window" lastClr="FFFFFF"/>
       </a:lt1>
       <a:dk2>
-        <a:srgbClr val="1F497D"/>
+        <a:srgbClr val="0E2841"/>
       </a:dk2>
       <a:lt2>
-        <a:srgbClr val="EEECE1"/>
+        <a:srgbClr val="E8E8E8"/>
       </a:lt2>
       <a:accent1>
-        <a:srgbClr val="4F81BD"/>
+        <a:srgbClr val="156082"/>
       </a:accent1>
       <a:accent2>
-        <a:srgbClr val="C0504D"/>
+        <a:srgbClr val="E97132"/>
       </a:accent2>
       <a:accent3>
-        <a:srgbClr val="9BBB59"/>
+        <a:srgbClr val="196B24"/>
       </a:accent3>
       <a:accent4>
-        <a:srgbClr val="8064A2"/>
+        <a:srgbClr val="0F9ED5"/>
       </a:accent4>
       <a:accent5>
-        <a:srgbClr val="4BACC6"/>
+        <a:srgbClr val="A02B93"/>
       </a:accent5>
       <a:accent6>
-        <a:srgbClr val="F79646"/>
+        <a:srgbClr val="4EA72E"/>
       </a:accent6>
       <a:hlink>
-        <a:srgbClr val="0000FF"/>
+        <a:srgbClr val="467886"/>
       </a:hlink>
       <a:folHlink>
-        <a:srgbClr val="800080"/>
+        <a:srgbClr val="96607D"/>
       </a:folHlink>
     </a:clrScheme>
     <a:fontScheme name="Office">
       <a:majorFont>
-        <a:latin typeface="Calibri"/>
+        <a:latin typeface="Aptos Display" panose="02110004020202020204"/>
         <a:ea typeface=""/>
         <a:cs typeface=""/>
-        <a:font script="Jpan" typeface="ＭＳ ゴシック"/>
+        <a:font script="Jpan" typeface="游ゴシック Light"/>
         <a:font script="Hang" typeface="맑은 고딕"/>
-        <a:font script="Hans" typeface="宋体"/>
+        <a:font script="Hans" typeface="等线 Light"/>
         <a:font script="Hant" typeface="新細明體"/>
         <a:font script="Arab" typeface="Times New Roman"/>
         <a:font script="Hebr" typeface="Times New Roman"/>
@@ -24309,14 +24375,31 @@
         <a:font script="Viet" typeface="Times New Roman"/>
         <a:font script="Uigh" typeface="Microsoft Uighur"/>
         <a:font script="Geor" typeface="Sylfaen"/>
+        <a:font script="Armn" typeface="Arial"/>
+        <a:font script="Bugi" typeface="Leelawadee UI"/>
+        <a:font script="Bopo" typeface="Microsoft JhengHei"/>
+        <a:font script="Java" typeface="Javanese Text"/>
+        <a:font script="Lisu" typeface="Segoe UI"/>
+        <a:font script="Mymr" typeface="Myanmar Text"/>
+        <a:font script="Nkoo" typeface="Ebrima"/>
+        <a:font script="Olck" typeface="Nirmala UI"/>
+        <a:font script="Osma" typeface="Ebrima"/>
+        <a:font script="Phag" typeface="Phagspa"/>
+        <a:font script="Syrn" typeface="Estrangelo Edessa"/>
+        <a:font script="Syrj" typeface="Estrangelo Edessa"/>
+        <a:font script="Syre" typeface="Estrangelo Edessa"/>
+        <a:font script="Sora" typeface="Nirmala UI"/>
+        <a:font script="Tale" typeface="Microsoft Tai Le"/>
+        <a:font script="Talu" typeface="Microsoft New Tai Lue"/>
+        <a:font script="Tfng" typeface="Ebrima"/>
       </a:majorFont>
       <a:minorFont>
-        <a:latin typeface="Cambria"/>
+        <a:latin typeface="Aptos" panose="02110004020202020204"/>
         <a:ea typeface=""/>
         <a:cs typeface=""/>
-        <a:font script="Jpan" typeface="ＭＳ 明朝"/>
+        <a:font script="Jpan" typeface="游明朝"/>
         <a:font script="Hang" typeface="맑은 고딕"/>
-        <a:font script="Hans" typeface="宋体"/>
+        <a:font script="Hans" typeface="等线"/>
         <a:font script="Hant" typeface="新細明體"/>
         <a:font script="Arab" typeface="Arial"/>
         <a:font script="Hebr" typeface="Arial"/>
@@ -24344,6 +24427,23 @@
         <a:font script="Viet" typeface="Arial"/>
         <a:font script="Uigh" typeface="Microsoft Uighur"/>
         <a:font script="Geor" typeface="Sylfaen"/>
+        <a:font script="Armn" typeface="Arial"/>
+        <a:font script="Bugi" typeface="Leelawadee UI"/>
+        <a:font script="Bopo" typeface="Microsoft JhengHei"/>
+        <a:font script="Java" typeface="Javanese Text"/>
+        <a:font script="Lisu" typeface="Segoe UI"/>
+        <a:font script="Mymr" typeface="Myanmar Text"/>
+        <a:font script="Nkoo" typeface="Ebrima"/>
+        <a:font script="Olck" typeface="Nirmala UI"/>
+        <a:font script="Osma" typeface="Ebrima"/>
+        <a:font script="Phag" typeface="Phagspa"/>
+        <a:font script="Syrn" typeface="Estrangelo Edessa"/>
+        <a:font script="Syrj" typeface="Estrangelo Edessa"/>
+        <a:font script="Syre" typeface="Estrangelo Edessa"/>
+        <a:font script="Sora" typeface="Nirmala UI"/>
+        <a:font script="Tale" typeface="Microsoft Tai Le"/>
+        <a:font script="Talu" typeface="Microsoft New Tai Lue"/>
+        <a:font script="Tfng" typeface="Ebrima"/>
       </a:minorFont>
     </a:fontScheme>
     <a:fmtScheme name="Office">
@@ -24355,180 +24455,136 @@
           <a:gsLst>
             <a:gs pos="0">
               <a:schemeClr val="phClr">
-                <a:tint val="50000"/>
-                <a:satMod val="300000"/>
+                <a:lumMod val="110000"/>
+                <a:satMod val="105000"/>
+                <a:tint val="67000"/>
               </a:schemeClr>
             </a:gs>
-            <a:gs pos="35000">
+            <a:gs pos="50000">
               <a:schemeClr val="phClr">
-                <a:tint val="37000"/>
-                <a:satMod val="300000"/>
+                <a:lumMod val="105000"/>
+                <a:satMod val="103000"/>
+                <a:tint val="73000"/>
               </a:schemeClr>
             </a:gs>
             <a:gs pos="100000">
               <a:schemeClr val="phClr">
-                <a:tint val="15000"/>
-                <a:satMod val="350000"/>
+                <a:lumMod val="105000"/>
+                <a:satMod val="109000"/>
+                <a:tint val="81000"/>
               </a:schemeClr>
             </a:gs>
           </a:gsLst>
-          <a:lin ang="16200000" scaled="1"/>
+          <a:lin ang="5400000" scaled="0"/>
         </a:gradFill>
         <a:gradFill rotWithShape="1">
           <a:gsLst>
             <a:gs pos="0">
               <a:schemeClr val="phClr">
-                <a:tint val="100000"/>
+                <a:satMod val="103000"/>
+                <a:lumMod val="102000"/>
+                <a:tint val="94000"/>
+              </a:schemeClr>
+            </a:gs>
+            <a:gs pos="50000">
+              <a:schemeClr val="phClr">
+                <a:satMod val="110000"/>
+                <a:lumMod val="100000"/>
                 <a:shade val="100000"/>
-                <a:satMod val="130000"/>
               </a:schemeClr>
             </a:gs>
             <a:gs pos="100000">
               <a:schemeClr val="phClr">
-                <a:tint val="50000"/>
-                <a:shade val="100000"/>
-                <a:satMod val="350000"/>
+                <a:lumMod val="99000"/>
+                <a:satMod val="120000"/>
+                <a:shade val="78000"/>
               </a:schemeClr>
             </a:gs>
           </a:gsLst>
-          <a:lin ang="16200000" scaled="0"/>
+          <a:lin ang="5400000" scaled="0"/>
         </a:gradFill>
       </a:fillStyleLst>
       <a:lnStyleLst>
-        <a:ln w="9525" cap="flat" cmpd="sng" algn="ctr">
+        <a:ln w="12700" cap="flat" cmpd="sng" algn="ctr">
           <a:solidFill>
-            <a:schemeClr val="phClr">
-              <a:shade val="95000"/>
-              <a:satMod val="105000"/>
-            </a:schemeClr>
+            <a:schemeClr val="phClr"/>
           </a:solidFill>
           <a:prstDash val="solid"/>
+          <a:miter lim="800000"/>
+        </a:ln>
+        <a:ln w="19050" cap="flat" cmpd="sng" algn="ctr">
+          <a:solidFill>
+            <a:schemeClr val="phClr"/>
+          </a:solidFill>
+          <a:prstDash val="solid"/>
+          <a:miter lim="800000"/>
         </a:ln>
         <a:ln w="25400" cap="flat" cmpd="sng" algn="ctr">
           <a:solidFill>
             <a:schemeClr val="phClr"/>
           </a:solidFill>
           <a:prstDash val="solid"/>
-        </a:ln>
-        <a:ln w="38100" cap="flat" cmpd="sng" algn="ctr">
-          <a:solidFill>
-            <a:schemeClr val="phClr"/>
-          </a:solidFill>
-          <a:prstDash val="solid"/>
+          <a:miter lim="800000"/>
         </a:ln>
       </a:lnStyleLst>
       <a:effectStyleLst>
         <a:effectStyle>
+          <a:effectLst/>
+        </a:effectStyle>
+        <a:effectStyle>
+          <a:effectLst/>
+        </a:effectStyle>
+        <a:effectStyle>
           <a:effectLst>
-            <a:outerShdw blurRad="40000" dist="20000" dir="5400000" rotWithShape="0">
+            <a:outerShdw blurRad="57150" dist="19050" dir="5400000" algn="ctr" rotWithShape="0">
               <a:srgbClr val="000000">
-                <a:alpha val="38000"/>
+                <a:alpha val="63000"/>
               </a:srgbClr>
             </a:outerShdw>
           </a:effectLst>
-        </a:effectStyle>
-        <a:effectStyle>
-          <a:effectLst>
-            <a:outerShdw blurRad="40000" dist="23000" dir="5400000" rotWithShape="0">
-              <a:srgbClr val="000000">
-                <a:alpha val="35000"/>
-              </a:srgbClr>
-            </a:outerShdw>
-          </a:effectLst>
-        </a:effectStyle>
-        <a:effectStyle>
-          <a:effectLst>
-            <a:outerShdw blurRad="40000" dist="23000" dir="5400000" rotWithShape="0">
-              <a:srgbClr val="000000">
-                <a:alpha val="35000"/>
-              </a:srgbClr>
-            </a:outerShdw>
-          </a:effectLst>
-          <a:scene3d>
-            <a:camera prst="orthographicFront">
-              <a:rot lat="0" lon="0" rev="0"/>
-            </a:camera>
-            <a:lightRig rig="threePt" dir="t">
-              <a:rot lat="0" lon="0" rev="1200000"/>
-            </a:lightRig>
-          </a:scene3d>
-          <a:sp3d>
-            <a:bevelT w="63500" h="25400"/>
-          </a:sp3d>
         </a:effectStyle>
       </a:effectStyleLst>
       <a:bgFillStyleLst>
         <a:solidFill>
           <a:schemeClr val="phClr"/>
         </a:solidFill>
+        <a:solidFill>
+          <a:schemeClr val="phClr">
+            <a:tint val="95000"/>
+            <a:satMod val="170000"/>
+          </a:schemeClr>
+        </a:solidFill>
         <a:gradFill rotWithShape="1">
           <a:gsLst>
             <a:gs pos="0">
               <a:schemeClr val="phClr">
-                <a:tint val="40000"/>
-                <a:satMod val="350000"/>
+                <a:tint val="93000"/>
+                <a:satMod val="150000"/>
+                <a:shade val="98000"/>
+                <a:lumMod val="102000"/>
               </a:schemeClr>
             </a:gs>
-            <a:gs pos="40000">
+            <a:gs pos="50000">
               <a:schemeClr val="phClr">
-                <a:tint val="45000"/>
-                <a:shade val="99000"/>
-                <a:satMod val="350000"/>
+                <a:tint val="98000"/>
+                <a:satMod val="130000"/>
+                <a:shade val="90000"/>
+                <a:lumMod val="103000"/>
               </a:schemeClr>
             </a:gs>
             <a:gs pos="100000">
               <a:schemeClr val="phClr">
-                <a:shade val="20000"/>
-                <a:satMod val="255000"/>
+                <a:shade val="63000"/>
+                <a:satMod val="120000"/>
               </a:schemeClr>
             </a:gs>
           </a:gsLst>
-          <a:path path="circle">
-            <a:fillToRect l="50000" t="-80000" r="50000" b="180000"/>
-          </a:path>
-        </a:gradFill>
-        <a:gradFill rotWithShape="1">
-          <a:gsLst>
-            <a:gs pos="0">
-              <a:schemeClr val="phClr">
-                <a:tint val="80000"/>
-                <a:satMod val="300000"/>
-              </a:schemeClr>
-            </a:gs>
-            <a:gs pos="100000">
-              <a:schemeClr val="phClr">
-                <a:shade val="30000"/>
-                <a:satMod val="200000"/>
-              </a:schemeClr>
-            </a:gs>
-          </a:gsLst>
-          <a:path path="circle">
-            <a:fillToRect l="50000" t="50000" r="50000" b="50000"/>
-          </a:path>
+          <a:lin ang="5400000" scaled="0"/>
         </a:gradFill>
       </a:bgFillStyleLst>
     </a:fmtScheme>
   </a:themeElements>
   <a:objectDefaults>
-    <a:spDef>
-      <a:spPr/>
-      <a:bodyPr/>
-      <a:lstStyle/>
-      <a:style>
-        <a:lnRef idx="1">
-          <a:schemeClr val="accent1"/>
-        </a:lnRef>
-        <a:fillRef idx="3">
-          <a:schemeClr val="accent1"/>
-        </a:fillRef>
-        <a:effectRef idx="2">
-          <a:schemeClr val="accent1"/>
-        </a:effectRef>
-        <a:fontRef idx="minor">
-          <a:schemeClr val="lt1"/>
-        </a:fontRef>
-      </a:style>
-    </a:spDef>
     <a:lnDef>
       <a:spPr/>
       <a:bodyPr/>
@@ -24550,6 +24606,11 @@
     </a:lnDef>
   </a:objectDefaults>
   <a:extraClrSchemeLst/>
+  <a:extLst>
+    <a:ext uri="{05A4C25C-085E-4340-85A3-A5531E510DB2}">
+      <thm15:themeFamily xmlns:thm15="http://schemas.microsoft.com/office/thememl/2012/main" name="Office Theme" id="{2E142A2C-CD16-42D6-873A-C26D2A0506FA}" vid="{1BDDFF52-6CD6-40A5-AB3C-68EB2F1E4D0A}"/>
+    </a:ext>
+  </a:extLst>
 </a:theme>
 </file>
 

</xml_diff>